<commit_message>
docs(parts): tree survey fix — P7 dispute rows + P12 note
Edit existing docs/parts-module-file-p1-p12.docx (base hub-integ-p2p3-v3 c151e53):
- Add 3 P7 dispute rows after existing P7 (R-34):
  - R-32: /parts/orders/[id]/dispute (WeeeR buyer dispute report)
  - A-17: /disputes (Admin dispute queue)
  - A-18: /disputes/[id] (Admin adjudication + escrow resolve)
- Update P12 note: ShopIdSwitcher = layout component · ไม่ใช่จอแยก · annotates R-51

17 rows → 20 rows × 9 cols | bg D1FAE5 (P7 family)
Ref: Advisor Gen 115 · HUB Gen 61 CMD
</commit_message>
<xml_diff>
--- a/docs/parts-module-file-p1-p12.docx
+++ b/docs/parts-module-file-p1-p12.docx
@@ -2253,6 +2253,529 @@
         <w:tc>
           <w:tcPr>
             <w:tcW w:type="dxa" w:w="1020"/>
+            <w:shd w:fill="D1FAE5" w:val="clear" w:color="auto"/>
+            <w:vAlign w:val="center"/>
+          </w:tcPr>
+          <w:p>
+            <w:r>
+              <w:rPr>
+                <w:sz w:val="18"/>
+              </w:rPr>
+              <w:t xml:space="preserve">R-32</w:t>
+            </w:r>
+          </w:p>
+        </w:tc>
+        <w:tc>
+          <w:tcPr>
+            <w:tcW w:type="dxa" w:w="1814"/>
+            <w:shd w:fill="D1FAE5" w:val="clear" w:color="auto"/>
+            <w:vAlign w:val="center"/>
+          </w:tcPr>
+          <w:p>
+            <w:r>
+              <w:rPr>
+                <w:sz w:val="18"/>
+              </w:rPr>
+              <w:t xml:space="preserve">รายงาน Dispute</w:t>
+            </w:r>
+            <w:br/>
+            <w:r>
+              <w:rPr>
+                <w:sz w:val="18"/>
+              </w:rPr>
+              <w:t xml:space="preserve">(PARTS-BUYER-DISPUTE)</w:t>
+            </w:r>
+          </w:p>
+        </w:tc>
+        <w:tc>
+          <w:tcPr>
+            <w:tcW w:type="dxa" w:w="1587"/>
+            <w:shd w:fill="D1FAE5" w:val="clear" w:color="auto"/>
+            <w:vAlign w:val="center"/>
+          </w:tcPr>
+          <w:p>
+            <w:r>
+              <w:rPr>
+                <w:sz w:val="18"/>
+              </w:rPr>
+              <w:t xml:space="preserve">R-34 (Buyer Order Detail</w:t>
+            </w:r>
+            <w:br/>
+            <w:r>
+              <w:rPr>
+                <w:sz w:val="18"/>
+              </w:rPr>
+              <w:t xml:space="preserve">— stage=received)</w:t>
+            </w:r>
+          </w:p>
+        </w:tc>
+        <w:tc>
+          <w:tcPr>
+            <w:tcW w:type="dxa" w:w="1984"/>
+            <w:shd w:fill="D1FAE5" w:val="clear" w:color="auto"/>
+            <w:vAlign w:val="center"/>
+          </w:tcPr>
+          <w:p>
+            <w:r>
+              <w:rPr>
+                <w:sz w:val="18"/>
+              </w:rPr>
+              <w:t xml:space="preserve">P7 dispute: ผู้ซื้อพบปัญหา</w:t>
+            </w:r>
+            <w:br/>
+            <w:r>
+              <w:rPr>
+                <w:sz w:val="18"/>
+              </w:rPr>
+              <w:t xml:space="preserve">(ของไม่ตรง/เสียหาย)</w:t>
+            </w:r>
+            <w:br/>
+            <w:r>
+              <w:rPr>
+                <w:sz w:val="18"/>
+              </w:rPr>
+              <w:t xml:space="preserve">หลังกด ยืนยันรับ</w:t>
+            </w:r>
+          </w:p>
+        </w:tc>
+        <w:tc>
+          <w:tcPr>
+            <w:tcW w:type="dxa" w:w="1701"/>
+            <w:shd w:fill="D1FAE5" w:val="clear" w:color="auto"/>
+            <w:vAlign w:val="center"/>
+          </w:tcPr>
+          <w:p>
+            <w:r>
+              <w:rPr>
+                <w:sz w:val="18"/>
+              </w:rPr>
+              <w:t xml:space="preserve">ส่ง dispute form</w:t>
+            </w:r>
+            <w:br/>
+            <w:r>
+              <w:rPr>
+                <w:sz w:val="18"/>
+              </w:rPr>
+              <w:t xml:space="preserve">→ A-17 (Admin Disputes List)</w:t>
+            </w:r>
+          </w:p>
+        </w:tc>
+        <w:tc>
+          <w:tcPr>
+            <w:tcW w:type="dxa" w:w="1984"/>
+            <w:shd w:fill="D1FAE5" w:val="clear" w:color="auto"/>
+            <w:vAlign w:val="center"/>
+          </w:tcPr>
+          <w:p>
+            <w:r>
+              <w:rPr>
+                <w:sz w:val="18"/>
+              </w:rPr>
+              <w:t xml:space="preserve">Admin</w:t>
+            </w:r>
+            <w:br/>
+            <w:r>
+              <w:rPr>
+                <w:sz w:val="18"/>
+              </w:rPr>
+              <w:t xml:space="preserve">[§8] A-17: dispute ใหม่เข้า queue</w:t>
+            </w:r>
+          </w:p>
+        </w:tc>
+        <w:tc>
+          <w:tcPr>
+            <w:tcW w:type="dxa" w:w="680"/>
+            <w:shd w:fill="D1FAE5" w:val="clear" w:color="auto"/>
+            <w:vAlign w:val="center"/>
+          </w:tcPr>
+          <w:p>
+            <w:r>
+              <w:rPr>
+                <w:sz w:val="18"/>
+              </w:rPr>
+              <w:t xml:space="preserve">P7</w:t>
+            </w:r>
+          </w:p>
+        </w:tc>
+        <w:tc>
+          <w:tcPr>
+            <w:tcW w:type="dxa" w:w="2551"/>
+            <w:shd w:fill="D1FAE5" w:val="clear" w:color="auto"/>
+            <w:vAlign w:val="center"/>
+          </w:tcPr>
+          <w:p>
+            <w:r>
+              <w:rPr>
+                <w:sz w:val="18"/>
+              </w:rPr>
+              <w:t xml:space="preserve">D-6: dispute flow จาก received stage</w:t>
+            </w:r>
+            <w:br/>
+            <w:r>
+              <w:rPr>
+                <w:sz w:val="18"/>
+              </w:rPr>
+              <w:t xml:space="preserve">Route: /parts/orders/[id]/dispute</w:t>
+            </w:r>
+          </w:p>
+        </w:tc>
+        <w:tc>
+          <w:tcPr>
+            <w:tcW w:type="dxa" w:w="1814"/>
+            <w:shd w:fill="D1FAE5" w:val="clear" w:color="auto"/>
+            <w:vAlign w:val="center"/>
+          </w:tcPr>
+          <w:p>
+            <w:r>
+              <w:rPr>
+                <w:sz w:val="18"/>
+              </w:rPr>
+              <w:t xml:space="preserve">http://localhost:3001/parts/orders/{id}/dispute</w:t>
+            </w:r>
+          </w:p>
+        </w:tc>
+      </w:tr>
+      <w:tr>
+        <w:tc>
+          <w:tcPr>
+            <w:tcW w:type="dxa" w:w="1020"/>
+            <w:shd w:fill="D1FAE5" w:val="clear" w:color="auto"/>
+            <w:vAlign w:val="center"/>
+          </w:tcPr>
+          <w:p>
+            <w:r>
+              <w:rPr>
+                <w:sz w:val="18"/>
+              </w:rPr>
+              <w:t xml:space="preserve">A-17</w:t>
+            </w:r>
+          </w:p>
+        </w:tc>
+        <w:tc>
+          <w:tcPr>
+            <w:tcW w:type="dxa" w:w="1814"/>
+            <w:shd w:fill="D1FAE5" w:val="clear" w:color="auto"/>
+            <w:vAlign w:val="center"/>
+          </w:tcPr>
+          <w:p>
+            <w:r>
+              <w:rPr>
+                <w:sz w:val="18"/>
+              </w:rPr>
+              <w:t xml:space="preserve">Disputes List</w:t>
+            </w:r>
+            <w:br/>
+            <w:r>
+              <w:rPr>
+                <w:sz w:val="18"/>
+              </w:rPr>
+              <w:t xml:space="preserve">(Admin — รายการ Dispute)</w:t>
+            </w:r>
+          </w:p>
+        </w:tc>
+        <w:tc>
+          <w:tcPr>
+            <w:tcW w:type="dxa" w:w="1587"/>
+            <w:shd w:fill="D1FAE5" w:val="clear" w:color="auto"/>
+            <w:vAlign w:val="center"/>
+          </w:tcPr>
+          <w:p>
+            <w:r>
+              <w:rPr>
+                <w:sz w:val="18"/>
+              </w:rPr>
+              <w:t xml:space="preserve">R-32 (WeeeR ส่ง dispute)</w:t>
+            </w:r>
+          </w:p>
+        </w:tc>
+        <w:tc>
+          <w:tcPr>
+            <w:tcW w:type="dxa" w:w="1984"/>
+            <w:shd w:fill="D1FAE5" w:val="clear" w:color="auto"/>
+            <w:vAlign w:val="center"/>
+          </w:tcPr>
+          <w:p>
+            <w:r>
+              <w:rPr>
+                <w:sz w:val="18"/>
+              </w:rPr>
+              <w:t xml:space="preserve">Admin เห็น dispute ใหม่</w:t>
+            </w:r>
+            <w:br/>
+            <w:r>
+              <w:rPr>
+                <w:sz w:val="18"/>
+              </w:rPr>
+              <w:t xml:space="preserve">from Parts B2B</w:t>
+            </w:r>
+          </w:p>
+        </w:tc>
+        <w:tc>
+          <w:tcPr>
+            <w:tcW w:type="dxa" w:w="1701"/>
+            <w:shd w:fill="D1FAE5" w:val="clear" w:color="auto"/>
+            <w:vAlign w:val="center"/>
+          </w:tcPr>
+          <w:p>
+            <w:r>
+              <w:rPr>
+                <w:sz w:val="18"/>
+              </w:rPr>
+              <w:t xml:space="preserve">→ A-18 (Dispute Detail)</w:t>
+            </w:r>
+            <w:br/>
+            <w:r>
+              <w:rPr>
+                <w:sz w:val="18"/>
+              </w:rPr>
+              <w:t xml:space="preserve">คลิกดูรายละเอียด</w:t>
+            </w:r>
+          </w:p>
+        </w:tc>
+        <w:tc>
+          <w:tcPr>
+            <w:tcW w:type="dxa" w:w="1984"/>
+            <w:shd w:fill="D1FAE5" w:val="clear" w:color="auto"/>
+            <w:vAlign w:val="center"/>
+          </w:tcPr>
+          <w:p>
+            <w:r>
+              <w:rPr>
+                <w:sz w:val="18"/>
+              </w:rPr>
+              <w:t xml:space="preserve">Admin เท่านั้น</w:t>
+            </w:r>
+          </w:p>
+        </w:tc>
+        <w:tc>
+          <w:tcPr>
+            <w:tcW w:type="dxa" w:w="680"/>
+            <w:shd w:fill="D1FAE5" w:val="clear" w:color="auto"/>
+            <w:vAlign w:val="center"/>
+          </w:tcPr>
+          <w:p>
+            <w:r>
+              <w:rPr>
+                <w:sz w:val="18"/>
+              </w:rPr>
+              <w:t xml:space="preserve">P7</w:t>
+            </w:r>
+          </w:p>
+        </w:tc>
+        <w:tc>
+          <w:tcPr>
+            <w:tcW w:type="dxa" w:w="2551"/>
+            <w:shd w:fill="D1FAE5" w:val="clear" w:color="auto"/>
+            <w:vAlign w:val="center"/>
+          </w:tcPr>
+          <w:p>
+            <w:r>
+              <w:rPr>
+                <w:sz w:val="18"/>
+              </w:rPr>
+              <w:t xml:space="preserve">Admin-only screen</w:t>
+            </w:r>
+            <w:br/>
+            <w:r>
+              <w:rPr>
+                <w:sz w:val="18"/>
+              </w:rPr>
+              <w:t xml:space="preserve">Route: /disputes</w:t>
+            </w:r>
+          </w:p>
+        </w:tc>
+        <w:tc>
+          <w:tcPr>
+            <w:tcW w:type="dxa" w:w="1814"/>
+            <w:shd w:fill="D1FAE5" w:val="clear" w:color="auto"/>
+            <w:vAlign w:val="center"/>
+          </w:tcPr>
+          <w:p>
+            <w:r>
+              <w:rPr>
+                <w:sz w:val="18"/>
+              </w:rPr>
+              <w:t xml:space="preserve">http://localhost:3000/disputes</w:t>
+            </w:r>
+          </w:p>
+        </w:tc>
+      </w:tr>
+      <w:tr>
+        <w:tc>
+          <w:tcPr>
+            <w:tcW w:type="dxa" w:w="1020"/>
+            <w:shd w:fill="D1FAE5" w:val="clear" w:color="auto"/>
+            <w:vAlign w:val="center"/>
+          </w:tcPr>
+          <w:p>
+            <w:r>
+              <w:rPr>
+                <w:sz w:val="18"/>
+              </w:rPr>
+              <w:t xml:space="preserve">A-18</w:t>
+            </w:r>
+          </w:p>
+        </w:tc>
+        <w:tc>
+          <w:tcPr>
+            <w:tcW w:type="dxa" w:w="1814"/>
+            <w:shd w:fill="D1FAE5" w:val="clear" w:color="auto"/>
+            <w:vAlign w:val="center"/>
+          </w:tcPr>
+          <w:p>
+            <w:r>
+              <w:rPr>
+                <w:sz w:val="18"/>
+              </w:rPr>
+              <w:t xml:space="preserve">Dispute Detail</w:t>
+            </w:r>
+            <w:br/>
+            <w:r>
+              <w:rPr>
+                <w:sz w:val="18"/>
+              </w:rPr>
+              <w:t xml:space="preserve">(Admin — แก้ไข/ตัดสิน)</w:t>
+            </w:r>
+          </w:p>
+        </w:tc>
+        <w:tc>
+          <w:tcPr>
+            <w:tcW w:type="dxa" w:w="1587"/>
+            <w:shd w:fill="D1FAE5" w:val="clear" w:color="auto"/>
+            <w:vAlign w:val="center"/>
+          </w:tcPr>
+          <w:p>
+            <w:r>
+              <w:rPr>
+                <w:sz w:val="18"/>
+              </w:rPr>
+              <w:t xml:space="preserve">A-17 (Disputes List)</w:t>
+            </w:r>
+          </w:p>
+        </w:tc>
+        <w:tc>
+          <w:tcPr>
+            <w:tcW w:type="dxa" w:w="1984"/>
+            <w:shd w:fill="D1FAE5" w:val="clear" w:color="auto"/>
+            <w:vAlign w:val="center"/>
+          </w:tcPr>
+          <w:p>
+            <w:r>
+              <w:rPr>
+                <w:sz w:val="18"/>
+              </w:rPr>
+              <w:t xml:space="preserve">Admin พิจารณา dispute:</w:t>
+            </w:r>
+            <w:br/>
+            <w:r>
+              <w:rPr>
+                <w:sz w:val="18"/>
+              </w:rPr>
+              <w:t xml:space="preserve">refund เต็ม/บางส่วน</w:t>
+            </w:r>
+            <w:br/>
+            <w:r>
+              <w:rPr>
+                <w:sz w:val="18"/>
+              </w:rPr>
+              <w:t xml:space="preserve">หรือ ยืนยันผู้ขาย</w:t>
+            </w:r>
+          </w:p>
+        </w:tc>
+        <w:tc>
+          <w:tcPr>
+            <w:tcW w:type="dxa" w:w="1701"/>
+            <w:shd w:fill="D1FAE5" w:val="clear" w:color="auto"/>
+            <w:vAlign w:val="center"/>
+          </w:tcPr>
+          <w:p>
+            <w:r>
+              <w:rPr>
+                <w:sz w:val="18"/>
+              </w:rPr>
+              <w:t xml:space="preserve">resolve → escrow adjudication</w:t>
+            </w:r>
+            <w:br/>
+            <w:r>
+              <w:rPr>
+                <w:sz w:val="18"/>
+              </w:rPr>
+              <w:t xml:space="preserve">(refund ผู้ซื้อ หรือ release ผู้ขาย)</w:t>
+            </w:r>
+          </w:p>
+        </w:tc>
+        <w:tc>
+          <w:tcPr>
+            <w:tcW w:type="dxa" w:w="1984"/>
+            <w:shd w:fill="D1FAE5" w:val="clear" w:color="auto"/>
+            <w:vAlign w:val="center"/>
+          </w:tcPr>
+          <w:p>
+            <w:r>
+              <w:rPr>
+                <w:sz w:val="18"/>
+              </w:rPr>
+              <w:t xml:space="preserve">Admin เท่านั้น</w:t>
+            </w:r>
+          </w:p>
+        </w:tc>
+        <w:tc>
+          <w:tcPr>
+            <w:tcW w:type="dxa" w:w="680"/>
+            <w:shd w:fill="D1FAE5" w:val="clear" w:color="auto"/>
+            <w:vAlign w:val="center"/>
+          </w:tcPr>
+          <w:p>
+            <w:r>
+              <w:rPr>
+                <w:sz w:val="18"/>
+              </w:rPr>
+              <w:t xml:space="preserve">P7</w:t>
+            </w:r>
+          </w:p>
+        </w:tc>
+        <w:tc>
+          <w:tcPr>
+            <w:tcW w:type="dxa" w:w="2551"/>
+            <w:shd w:fill="D1FAE5" w:val="clear" w:color="auto"/>
+            <w:vAlign w:val="center"/>
+          </w:tcPr>
+          <w:p>
+            <w:r>
+              <w:rPr>
+                <w:sz w:val="18"/>
+              </w:rPr>
+              <w:t xml:space="preserve">Admin-only: escrow adjudication</w:t>
+            </w:r>
+            <w:br/>
+            <w:r>
+              <w:rPr>
+                <w:sz w:val="18"/>
+              </w:rPr>
+              <w:t xml:space="preserve">Route: /disputes/[id]</w:t>
+            </w:r>
+          </w:p>
+        </w:tc>
+        <w:tc>
+          <w:tcPr>
+            <w:tcW w:type="dxa" w:w="1814"/>
+            <w:shd w:fill="D1FAE5" w:val="clear" w:color="auto"/>
+            <w:vAlign w:val="center"/>
+          </w:tcPr>
+          <w:p>
+            <w:r>
+              <w:rPr>
+                <w:sz w:val="18"/>
+              </w:rPr>
+              <w:t xml:space="preserve">http://localhost:3000/disputes/{id}</w:t>
+            </w:r>
+          </w:p>
+        </w:tc>
+      </w:tr>
+      <w:tr>
+        <w:tc>
+          <w:tcPr>
+            <w:tcW w:type="dxa" w:w="1020"/>
             <w:shd w:fill="FEE2E2" w:val="clear"/>
             <w:vAlign w:val="center"/>
           </w:tcPr>
@@ -3146,6 +3669,13 @@
               <w:br/>
               <w:t>disabled=true ระหว่าง modal เปิด (race condition guard)</w:t>
             </w:r>
+            <w:br/>
+            <w:r>
+              <w:rPr>
+                <w:sz w:val="18"/>
+              </w:rPr>
+              <w:t xml:space="preserve">Note: layout component · ไม่ใช่จอแยก · annotates R-51 (Parts Hub)</w:t>
+            </w:r>
           </w:p>
         </w:tc>
         <w:tc>

</xml_diff>